<commit_message>
Record portrait-only and no-store-release decisions in the design doc
</commit_message>
<xml_diff>
--- a/Design Documents/Game Design Gott einer Zivilisation.docx
+++ b/Design Documents/Game Design Gott einer Zivilisation.docx
@@ -232,6 +232,25 @@
       </w:r>
       <w:r>
         <w:t xml:space="preserve">.</w:t>
+      </w:r>
+      <w:r>
+        <w:t xml:space="preserve"> </w:t>
+      </w:r>
+      <w:r>
+        <w:t xml:space="preserve">Das Spiel läuft im</w:t>
+      </w:r>
+      <w:r>
+        <w:t xml:space="preserve"> </w:t>
+      </w:r>
+      <w:r>
+        <w:rPr>
+          <w:bCs/>
+          <w:b/>
+        </w:rPr>
+        <w:t xml:space="preserve">Hochformat</w:t>
+      </w:r>
+      <w:r>
+        <w:t xml:space="preserve">, da es sich so unterwegs (z. B. beim Pendeln) leichter spielen lässt.</w:t>
       </w:r>
     </w:p>
     <w:p>
@@ -1482,7 +1501,7 @@
         <w:t xml:space="preserve"> </w:t>
       </w:r>
       <w:r>
-        <w:t xml:space="preserve">Android.</w:t>
+        <w:t xml:space="preserve">Android, nur Hochformat. Privates Spaßprojekt, keine Veröffentlichung im Play Store geplant.</w:t>
       </w:r>
     </w:p>
     <w:p>

</xml_diff>

<commit_message>
Record world-generation decisions in the design doc and README
</commit_message>
<xml_diff>
--- a/Design Documents/Game Design Gott einer Zivilisation.docx
+++ b/Design Documents/Game Design Gott einer Zivilisation.docx
@@ -275,6 +275,50 @@
         <w:t xml:space="preserve">Der Spieler beobachtet vor allem, wie sich die Welt bewegt und entwickelt. Eingreifen kann er nur indirekt über Fähigkeiten.</w:t>
       </w:r>
     </w:p>
+    <w:p>
+      <w:pPr>
+        <w:numPr>
+          <w:ilvl w:val="0"/>
+          <w:numId w:val="1002"/>
+        </w:numPr>
+        <w:pStyle w:val="Compact"/>
+      </w:pPr>
+      <w:r>
+        <w:rPr>
+          <w:bCs/>
+          <w:b/>
+        </w:rPr>
+        <w:t xml:space="preserve">Karte:</w:t>
+      </w:r>
+      <w:r>
+        <w:t xml:space="preserve"> </w:t>
+      </w:r>
+      <w:r>
+        <w:t xml:space="preserve">Hexfelder mit flacher Oberseite (flat-top). Biome als einfache Vektor-Icons, im Code gezeichnet (keine Bilddateien, scharf in jeder Zoomstufe). Schwenken und Pinch-Zoom; beim Herauszoomen werden Icons ausgeblendet.</w:t>
+      </w:r>
+    </w:p>
+    <w:p>
+      <w:pPr>
+        <w:numPr>
+          <w:ilvl w:val="0"/>
+          <w:numId w:val="1002"/>
+        </w:numPr>
+        <w:pStyle w:val="Compact"/>
+      </w:pPr>
+      <w:r>
+        <w:rPr>
+          <w:bCs/>
+          <w:b/>
+        </w:rPr>
+        <w:t xml:space="preserve">Hexfeld-Info:</w:t>
+      </w:r>
+      <w:r>
+        <w:t xml:space="preserve"> </w:t>
+      </w:r>
+      <w:r>
+        <w:t xml:space="preserve">Antippen eines Hexfelds zeigt ein Infofeld mit allen Werten.</w:t>
+      </w:r>
+    </w:p>
     <w:bookmarkEnd w:id="22"/>
     <w:bookmarkStart w:id="23" w:name="welt"/>
     <w:p>
@@ -332,6 +376,248 @@
       </w:pPr>
       <w:r>
         <w:t xml:space="preserve">Die Karte muss später veränderbar sein (Katastrophen, Weltveränderung durch Fähigkeiten).</w:t>
+      </w:r>
+    </w:p>
+    <w:p>
+      <w:pPr>
+        <w:numPr>
+          <w:ilvl w:val="0"/>
+          <w:numId w:val="1003"/>
+        </w:numPr>
+        <w:pStyle w:val="Compact"/>
+      </w:pPr>
+      <w:r>
+        <w:rPr>
+          <w:bCs/>
+          <w:b/>
+        </w:rPr>
+        <w:t xml:space="preserve">Größe:</w:t>
+      </w:r>
+      <w:r>
+        <w:t xml:space="preserve"> </w:t>
+      </w:r>
+      <w:r>
+        <w:t xml:space="preserve">Start mit 64 × 64 Hexfeldern (ca. 4.100). Daten und Darstellung sind auf deutlich größere Karten ausgelegt (Generator getestet bis 256 × 256).</w:t>
+      </w:r>
+    </w:p>
+    <w:p>
+      <w:pPr>
+        <w:numPr>
+          <w:ilvl w:val="0"/>
+          <w:numId w:val="1003"/>
+        </w:numPr>
+        <w:pStyle w:val="Compact"/>
+      </w:pPr>
+      <w:r>
+        <w:rPr>
+          <w:bCs/>
+          <w:b/>
+        </w:rPr>
+        <w:t xml:space="preserve">Form:</w:t>
+      </w:r>
+      <w:r>
+        <w:t xml:space="preserve"> </w:t>
+      </w:r>
+      <w:r>
+        <w:t xml:space="preserve">Je Seed Kontinente, ein Superkontinent (Pangäa) oder ein Archipel. Etwa 50 % Land.</w:t>
+      </w:r>
+    </w:p>
+    <w:p>
+      <w:pPr>
+        <w:numPr>
+          <w:ilvl w:val="0"/>
+          <w:numId w:val="1003"/>
+        </w:numPr>
+        <w:pStyle w:val="Compact"/>
+      </w:pPr>
+      <w:r>
+        <w:rPr>
+          <w:bCs/>
+          <w:b/>
+        </w:rPr>
+        <w:t xml:space="preserve">Ränder:</w:t>
+      </w:r>
+      <w:r>
+        <w:t xml:space="preserve"> </w:t>
+      </w:r>
+      <w:r>
+        <w:t xml:space="preserve">Die Karte läuft links und rechts um wie ein Globus. Oben und unten liegen die Pole.</w:t>
+      </w:r>
+    </w:p>
+    <w:p>
+      <w:pPr>
+        <w:numPr>
+          <w:ilvl w:val="0"/>
+          <w:numId w:val="1003"/>
+        </w:numPr>
+        <w:pStyle w:val="Compact"/>
+      </w:pPr>
+      <w:r>
+        <w:rPr>
+          <w:bCs/>
+          <w:b/>
+        </w:rPr>
+        <w:t xml:space="preserve">Biome:</w:t>
+      </w:r>
+      <w:r>
+        <w:t xml:space="preserve"> </w:t>
+      </w:r>
+      <w:r>
+        <w:t xml:space="preserve">Tiefsee, Küste (Flachwasser), See, Eis, Tundra, Ebene, Wald, Hügel, Gebirge, Wüste, Savanne, Dschungel, Sumpf. „Küste“ ist das flache Meer vor dem Land.</w:t>
+      </w:r>
+    </w:p>
+    <w:p>
+      <w:pPr>
+        <w:numPr>
+          <w:ilvl w:val="0"/>
+          <w:numId w:val="1003"/>
+        </w:numPr>
+        <w:pStyle w:val="Compact"/>
+      </w:pPr>
+      <w:r>
+        <w:rPr>
+          <w:bCs/>
+          <w:b/>
+        </w:rPr>
+        <w:t xml:space="preserve">Klima:</w:t>
+      </w:r>
+      <w:r>
+        <w:t xml:space="preserve"> </w:t>
+      </w:r>
+      <w:r>
+        <w:t xml:space="preserve">Temperatur aus Breitengrad und Höhe. Feuchtigkeit aus vorherrschenden Winden mit Regenschatten hinter Gebirgen, Trockengürtel um 30° und feuchtem Äquator.</w:t>
+      </w:r>
+    </w:p>
+    <w:p>
+      <w:pPr>
+        <w:numPr>
+          <w:ilvl w:val="0"/>
+          <w:numId w:val="1003"/>
+        </w:numPr>
+        <w:pStyle w:val="Compact"/>
+      </w:pPr>
+      <w:r>
+        <w:rPr>
+          <w:bCs/>
+          <w:b/>
+        </w:rPr>
+        <w:t xml:space="preserve">Flüsse und Seen:</w:t>
+      </w:r>
+      <w:r>
+        <w:t xml:space="preserve"> </w:t>
+      </w:r>
+      <w:r>
+        <w:t xml:space="preserve">Flüsse fließen durch Hexfelder bergab ins Meer und werden dabei größer. Abflusslose Senken und kleine abgeschlossene Gewässer werden Seen.</w:t>
+      </w:r>
+    </w:p>
+    <w:p>
+      <w:pPr>
+        <w:numPr>
+          <w:ilvl w:val="0"/>
+          <w:numId w:val="1003"/>
+        </w:numPr>
+        <w:pStyle w:val="Compact"/>
+      </w:pPr>
+      <w:r>
+        <w:rPr>
+          <w:bCs/>
+          <w:b/>
+        </w:rPr>
+        <w:t xml:space="preserve">Werte je Hexfeld:</w:t>
+      </w:r>
+      <w:r>
+        <w:t xml:space="preserve"> </w:t>
+      </w:r>
+      <w:r>
+        <w:t xml:space="preserve">Höhe, Temperatur, Feuchtigkeit, Fruchtbarkeit, Wild, Fisch, Holz, Stein, Erz, Gefahr und Reisekosten. Rohstoffe haben eine aktuelle Menge und eine natürliche Kapazität, damit später Erschöpfung, Abholzung und Nachwachsen möglich sind (noch nicht simuliert).</w:t>
+      </w:r>
+    </w:p>
+    <w:p>
+      <w:pPr>
+        <w:numPr>
+          <w:ilvl w:val="0"/>
+          <w:numId w:val="1003"/>
+        </w:numPr>
+        <w:pStyle w:val="Compact"/>
+      </w:pPr>
+      <w:r>
+        <w:rPr>
+          <w:bCs/>
+          <w:b/>
+        </w:rPr>
+        <w:t xml:space="preserve">Vorbereitet:</w:t>
+      </w:r>
+      <w:r>
+        <w:t xml:space="preserve"> </w:t>
+      </w:r>
+      <w:r>
+        <w:t xml:space="preserve">Besitzende Zivilisation, Bevölkerung und Glaube je Hexfeld; werden mit den Bewohnern befüllt.</w:t>
+      </w:r>
+    </w:p>
+    <w:p>
+      <w:pPr>
+        <w:numPr>
+          <w:ilvl w:val="0"/>
+          <w:numId w:val="1003"/>
+        </w:numPr>
+        <w:pStyle w:val="Compact"/>
+      </w:pPr>
+      <w:r>
+        <w:rPr>
+          <w:bCs/>
+          <w:b/>
+        </w:rPr>
+        <w:t xml:space="preserve">Sondervorkommen:</w:t>
+      </w:r>
+      <w:r>
+        <w:t xml:space="preserve"> </w:t>
+      </w:r>
+      <w:r>
+        <w:t xml:space="preserve">Metalle (Kupfer, Zinn, Eisen, Gold), Mineralien (Salz, Feuerstein, Marmor, Edelsteine), Reichtümer (Fischgründe, Wildpferde, Schwemmland, Gewürze) und mystische Orte (heilige Quelle, heiliger Hain, Meteorit, alte Ruinen). Mystische Orte sind Anknüpfungspunkte für Glauben und Propheten.</w:t>
+      </w:r>
+    </w:p>
+    <w:p>
+      <w:pPr>
+        <w:numPr>
+          <w:ilvl w:val="0"/>
+          <w:numId w:val="1003"/>
+        </w:numPr>
+        <w:pStyle w:val="Compact"/>
+      </w:pPr>
+      <w:r>
+        <w:rPr>
+          <w:bCs/>
+          <w:b/>
+        </w:rPr>
+        <w:t xml:space="preserve">Startort:</w:t>
+      </w:r>
+      <w:r>
+        <w:t xml:space="preserve"> </w:t>
+      </w:r>
+      <w:r>
+        <w:t xml:space="preserve">Der Generator wählt den Platz für den Stamm des Spielers: fruchtbar, Süßwasser in der Nähe, mildes Klima, nicht zu gefährlich, auf einer ausreichend großen Landmasse.</w:t>
+      </w:r>
+    </w:p>
+    <w:p>
+      <w:pPr>
+        <w:numPr>
+          <w:ilvl w:val="0"/>
+          <w:numId w:val="1003"/>
+        </w:numPr>
+        <w:pStyle w:val="Compact"/>
+      </w:pPr>
+      <w:r>
+        <w:rPr>
+          <w:bCs/>
+          <w:b/>
+        </w:rPr>
+        <w:t xml:space="preserve">Test:</w:t>
+      </w:r>
+      <w:r>
+        <w:t xml:space="preserve"> </w:t>
+      </w:r>
+      <w:r>
+        <w:t xml:space="preserve">Schaltfläche „New world“ erzeugt eine neue Welt; der Seed wird angezeigt, damit auffällige Welten gemeldet und nachgebaut werden können.</w:t>
       </w:r>
     </w:p>
     <w:bookmarkEnd w:id="23"/>

</xml_diff>

<commit_message>
Record civilization and inhabitant rules in the design doc and preview simulated territories without a phone
</commit_message>
<xml_diff>
--- a/Design Documents/Game Design Gott einer Zivilisation.docx
+++ b/Design Documents/Game Design Gott einer Zivilisation.docx
@@ -1,5 +1,43 @@
 
-<file path=word/document.xml><?xml version="1.0" encoding="utf-8"?>
+<file path=docProps\app.xml><?xml version="1.0" encoding="utf-8"?>
+<Properties xmlns="http://schemas.openxmlformats.org/officeDocument/2006/extended-properties" xmlns:vt="http://schemas.openxmlformats.org/officeDocument/2006/docPropsVTypes">
+  <Words>83</Words>
+  <SharedDoc>false</SharedDoc>
+  <HyperlinksChanged>false</HyperlinksChanged>
+  <Lines>12</Lines>
+  <AppVersion>12.0000</AppVersion>
+  <LinksUpToDate>false</LinksUpToDate>
+  <Application>Microsoft Word 12.0.0</Application>
+  <CharactersWithSpaces>583</CharactersWithSpaces>
+  <Template>Normal.dotm</Template>
+  <DocSecurity>0</DocSecurity>
+  <TotalTime>6</TotalTime>
+  <ScaleCrop>false</ScaleCrop>
+  <Characters>475</Characters>
+  <Paragraphs>8</Paragraphs>
+  <Pages>1</Pages>
+</Properties>
+</file>
+
+<file path=docProps\core.xml><?xml version="1.0" encoding="utf-8"?>
+<cp:coreProperties xmlns:cp="http://schemas.openxmlformats.org/package/2006/metadata/core-properties" xmlns:dc="http://purl.org/dc/elements/1.1/" xmlns:dcterms="http://purl.org/dc/terms/" xmlns:dcmitype="http://purl.org/dc/dcmitype/" xmlns:xsi="http://www.w3.org/2001/XMLSchema-instance">
+  <dc:title/>
+  <dc:creator/>
+  <cp:keywords/>
+  <dcterms:created xsi:type="dcterms:W3CDTF">2026-10-29T18:46:56Z</dcterms:created>
+  <dcterms:modified xsi:type="dcterms:W3CDTF">2026-10-29T18:46:56Z</dcterms:modified>
+</cp:coreProperties>
+</file>
+
+<file path=docProps\custom.xml><?xml version="1.0" encoding="utf-8"?>
+<Properties xmlns="http://schemas.openxmlformats.org/officeDocument/2006/custom-properties" xmlns:vt="http://schemas.openxmlformats.org/officeDocument/2006/docPropsVTypes"/>
+</file>
+
+<file path=word\comments.xml><?xml version="1.0" encoding="utf-8"?>
+<w:comments xmlns:w="http://schemas.openxmlformats.org/wordprocessingml/2006/main" xmlns:m="http://schemas.openxmlformats.org/officeDocument/2006/math" xmlns:r="http://schemas.openxmlformats.org/officeDocument/2006/relationships" xmlns:o="urn:schemas-microsoft-com:office:office" xmlns:v="urn:schemas-microsoft-com:vml" xmlns:w10="urn:schemas-microsoft-com:office:word" xmlns:a="http://schemas.openxmlformats.org/drawingml/2006/main" xmlns:pic="http://schemas.openxmlformats.org/drawingml/2006/picture" xmlns:wp="http://schemas.openxmlformats.org/drawingml/2006/wordprocessingDrawing"/>
+</file>
+
+<file path=word\document.xml><?xml version="1.0" encoding="utf-8"?>
 <w:document xmlns:w="http://schemas.openxmlformats.org/wordprocessingml/2006/main" xmlns:m="http://schemas.openxmlformats.org/officeDocument/2006/math" xmlns:r="http://schemas.openxmlformats.org/officeDocument/2006/relationships" xmlns:o="urn:schemas-microsoft-com:office:office" xmlns:v="urn:schemas-microsoft-com:vml" xmlns:w10="urn:schemas-microsoft-com:office:word" xmlns:a="http://schemas.openxmlformats.org/drawingml/2006/main" xmlns:pic="http://schemas.openxmlformats.org/drawingml/2006/picture" xmlns:wp="http://schemas.openxmlformats.org/drawingml/2006/wordprocessingDrawing">
   <w:body>
     <w:bookmarkStart w:id="32" w:name="game-design-gott-einer-zivilisation"/>
@@ -319,6 +357,44 @@
         <w:t xml:space="preserve">Antippen eines Hexfelds zeigt ein Infofeld mit allen Werten.</w:t>
       </w:r>
     </w:p>
+    <w:p>
+      <w:pPr>
+        <w:numPr>
+          <w:ilvl w:val="0"/>
+          <w:numId w:val="1002"/>
+        </w:numPr>
+        <w:pStyle w:val="Compact"/>
+      </w:pPr>
+      <w:r>
+        <w:rPr>
+          <w:bCs/>
+          <w:b/>
+        </w:rPr>
+        <w:t xml:space="preserve">Zeitsteuerung:</w:t>
+      </w:r>
+      <w:r>
+        <w:t xml:space="preserve"> 1 Tick = 1 Woche. Pause und drei Geschwindigkeiten mit 6, 26 und 104 Wochen pro Sekunde (ein Jahr in etwa 9 s, 2 s bzw. 0,5 s). Das Spiel startet auf der langsamsten Stufe. Läuft die App nicht im Vordergrund, steht die Zeit.</w:t>
+      </w:r>
+    </w:p>
+    <w:p>
+      <w:pPr>
+        <w:numPr>
+          <w:ilvl w:val="0"/>
+          <w:numId w:val="1002"/>
+        </w:numPr>
+        <w:pStyle w:val="Compact"/>
+      </w:pPr>
+      <w:r>
+        <w:rPr>
+          <w:bCs/>
+          <w:b/>
+        </w:rPr>
+        <w:t xml:space="preserve">Völker-Panel:</w:t>
+      </w:r>
+      <w:r>
+        <w:t xml:space="preserve"> Schaltfläche „Peoples“ zeigt Jahr, Bewohner und Gläubige, alle Zivilisationen mit Farbe, Herkunft, Größe, Gebiet, Anteil der Gläubigen und Kultur sowie die Chronik.</w:t>
+      </w:r>
+    </w:p>
     <w:bookmarkEnd w:id="22"/>
     <w:bookmarkStart w:id="23" w:name="welt"/>
     <w:p>
@@ -545,13 +621,10 @@
           <w:bCs/>
           <w:b/>
         </w:rPr>
-        <w:t xml:space="preserve">Vorbereitet:</w:t>
-      </w:r>
-      <w:r>
-        <w:t xml:space="preserve"> </w:t>
-      </w:r>
-      <w:r>
-        <w:t xml:space="preserve">Besitzende Zivilisation, Bevölkerung und Glaube je Hexfeld; werden mit den Bewohnern befüllt.</w:t>
+        <w:t xml:space="preserve">Gesellschaft je Hexfeld:</w:t>
+      </w:r>
+      <w:r>
+        <w:t xml:space="preserve"> Besitzende Zivilisation, Bevölkerung und durchschnittlicher Glaube. Wird vierteljährlich aus den Bewohnern berechnet und auf der Karte gezeigt: Farbfläche und Grenze je Zivilisation, ein Punkt je Siedlung, größer mit mehr Bewohnern. Das Hexfeld-Info zeigt Zivilisation, Bevölkerung und Glauben.</w:t>
       </w:r>
     </w:p>
     <w:p>
@@ -705,6 +778,158 @@
         <w:t xml:space="preserve">Sie handeln unabhängig (siedeln, handeln, Krieg, Bündnisse, Wanderung). Sie wachsen und entscheiden selbst, wohin sie ziehen.</w:t>
       </w:r>
     </w:p>
+    <w:p>
+      <w:pPr>
+        <w:numPr>
+          <w:ilvl w:val="0"/>
+          <w:numId w:val="1004"/>
+        </w:numPr>
+        <w:pStyle w:val="Compact"/>
+      </w:pPr>
+      <w:r>
+        <w:rPr>
+          <w:bCs/>
+          <w:b/>
+        </w:rPr>
+        <w:t xml:space="preserve">Entstehung neuer Zivilisationen:</w:t>
+      </w:r>
+      <w:r>
+        <w:t xml:space="preserve"> Auf zwei Wegen. Abspaltung: Siedlungen, die vom Zentrum der Zivilisation abgeschnitten oder mehr als 7 Hexfelder davon entfernt sind, können sich ab 25 Bewohnern lösen (etwa 8 % Chance pro Jahr, Mutter-Zivilisation ab 60 Bewohnern). Sie behalten 60 % ihres Glaubens an den Spieler, beten ihn als Zivilisation aber nicht mehr an. Neue Stämme: ab Jahr 25 erscheint gelegentlich (etwa 2 % pro Jahr) ein Stamm von 15–24 Menschen ohne Gott in leerem, fruchtbarem Land, mindestens 8 Hexfelder von allen anderen entfernt.</w:t>
+      </w:r>
+    </w:p>
+    <w:p>
+      <w:pPr>
+        <w:numPr>
+          <w:ilvl w:val="0"/>
+          <w:numId w:val="1004"/>
+        </w:numPr>
+        <w:pStyle w:val="Compact"/>
+      </w:pPr>
+      <w:r>
+        <w:rPr>
+          <w:bCs/>
+          <w:b/>
+        </w:rPr>
+        <w:t xml:space="preserve">Anzahl:</w:t>
+      </w:r>
+      <w:r>
+        <w:t xml:space="preserve"> Höchstens 6 Zivilisationen gleichzeitig. In Testläufen kommt die zweite nach etwa 50 Jahren dazu, nach etwa 125 Jahren sind es meist 6. Eine Zivilisation ohne Bewohner geht unter, ihr Platz wird frei.</w:t>
+      </w:r>
+    </w:p>
+    <w:p>
+      <w:pPr>
+        <w:numPr>
+          <w:ilvl w:val="0"/>
+          <w:numId w:val="1004"/>
+        </w:numPr>
+        <w:pStyle w:val="Compact"/>
+      </w:pPr>
+      <w:r>
+        <w:rPr>
+          <w:bCs/>
+          <w:b/>
+        </w:rPr>
+        <w:t xml:space="preserve">Kultur:</w:t>
+      </w:r>
+      <w:r>
+        <w:t xml:space="preserve"> Fünf Werte von 0 bis 1: seefahrend, kriegerisch, bäuerlich, wandernd, fromm. Sie entstehen aus dem Land rund um die erste Siedlung und gleichen sich jedes Jahr um 5 % an das bewohnte Land an: Küste macht seefahrend, Gefahr und raues Land kriegerisch, Fruchtbarkeit bäuerlich, offenes oder karges Land wandernd, Gefahr und Kargheit fromm. Abspaltungen starten zwischen der Kultur der Mutter-Zivilisation und der ihres Landes.</w:t>
+      </w:r>
+    </w:p>
+    <w:p>
+      <w:pPr>
+        <w:numPr>
+          <w:ilvl w:val="0"/>
+          <w:numId w:val="1004"/>
+        </w:numPr>
+        <w:pStyle w:val="Compact"/>
+      </w:pPr>
+      <w:r>
+        <w:rPr>
+          <w:bCs/>
+          <w:b/>
+        </w:rPr>
+        <w:t xml:space="preserve">Wirkung der Kultur (bisher):</w:t>
+      </w:r>
+      <w:r>
+        <w:t xml:space="preserve"> Sie bestimmt, welche Hexfelder als Siedlungsort gefallen, wie leicht Menschen weiterziehen, wie weit Siedlerzüge reichen, ob sie über Wasser setzen, und bei der Spieler-Zivilisation, wie schnell der Glaube wächst.</w:t>
+      </w:r>
+    </w:p>
+    <w:p>
+      <w:pPr>
+        <w:numPr>
+          <w:ilvl w:val="0"/>
+          <w:numId w:val="1004"/>
+        </w:numPr>
+        <w:pStyle w:val="Compact"/>
+      </w:pPr>
+      <w:r>
+        <w:rPr>
+          <w:bCs/>
+          <w:b/>
+        </w:rPr>
+        <w:t xml:space="preserve">Ausbreitung:</w:t>
+      </w:r>
+      <w:r>
+        <w:t xml:space="preserve"> Wird ein Hexfeld eng (ab 75 % der Tragfähigkeit), ziehen Bewohner ins attraktivste Nachbarfeld, seefahrende Völker auch über schmale Meeresstreifen. Zusätzlich zieht jährlich mit gewisser Wahrscheinlichkeit eine Siedlergruppe (6–11 Menschen) aus der engsten Siedlung einige Hexfelder weit in leeres Land. Fremdes Gebiet meiden sie, solange es keinen Krieg und keine Diplomatie gibt.</w:t>
+      </w:r>
+    </w:p>
+    <w:p>
+      <w:pPr>
+        <w:numPr>
+          <w:ilvl w:val="0"/>
+          <w:numId w:val="1004"/>
+        </w:numPr>
+        <w:pStyle w:val="Compact"/>
+      </w:pPr>
+      <w:r>
+        <w:rPr>
+          <w:bCs/>
+          <w:b/>
+        </w:rPr>
+        <w:t xml:space="preserve">Gebiet:</w:t>
+      </w:r>
+      <w:r>
+        <w:t xml:space="preserve"> Ein Hexfeld gehört der Zivilisation mit den meisten Bewohnern dort.</w:t>
+      </w:r>
+    </w:p>
+    <w:p>
+      <w:pPr>
+        <w:numPr>
+          <w:ilvl w:val="0"/>
+          <w:numId w:val="1004"/>
+        </w:numPr>
+        <w:pStyle w:val="Compact"/>
+      </w:pPr>
+      <w:r>
+        <w:rPr>
+          <w:bCs/>
+          <w:b/>
+        </w:rPr>
+        <w:t xml:space="preserve">Namen und Chronik:</w:t>
+      </w:r>
+      <w:r>
+        <w:t xml:space="preserve"> Zivilisationen bekommen zufällig erzeugte Namen. Gründung, Abspaltung, neue Stämme, Untergang und das Spielende werden mit Jahr in der Chronik festgehalten.</w:t>
+      </w:r>
+    </w:p>
+    <w:p>
+      <w:pPr>
+        <w:numPr>
+          <w:ilvl w:val="0"/>
+          <w:numId w:val="1004"/>
+        </w:numPr>
+        <w:pStyle w:val="Compact"/>
+      </w:pPr>
+      <w:r>
+        <w:rPr>
+          <w:bCs/>
+          <w:b/>
+        </w:rPr>
+        <w:t xml:space="preserve">Noch offen:</w:t>
+      </w:r>
+      <w:r>
+        <w:t xml:space="preserve"> Handel, Krieg, Bündnisse, eigene Religionen der Zivilisationen ohne Gott.</w:t>
+      </w:r>
+    </w:p>
     <w:bookmarkEnd w:id="24"/>
     <w:bookmarkStart w:id="25" w:name="bewohner-und-persönlichkeiten"/>
     <w:p>
@@ -859,6 +1084,63 @@
         <w:t xml:space="preserve">(Propheten, Herrscher, Helden) sind einzeln einsehbar und die Hebel der Geschichte. Sie entwickeln sich tiefer weiter und haben eine Geschichte. Sie entstehen meist von selbst, der Spieler kann sie fördern oder anstoßen.</w:t>
       </w:r>
     </w:p>
+    <w:p>
+      <w:pPr>
+        <w:numPr>
+          <w:ilvl w:val="0"/>
+          <w:numId w:val="1005"/>
+        </w:numPr>
+        <w:pStyle w:val="Compact"/>
+      </w:pPr>
+      <w:r>
+        <w:rPr>
+          <w:bCs/>
+          <w:b/>
+        </w:rPr>
+        <w:t xml:space="preserve">Stand der Umsetzung:</w:t>
+      </w:r>
+      <w:r>
+        <w:t xml:space="preserve"> Einfache Bewohner mit Alter, Wohnort, Zivilisation und Glaube. Jeder Bewohner wird einmal pro Jahr aktualisiert, gestaffelt über die 52 Wochen-Ticks. Sterblichkeit nach Alter, Gefahr und Hunger bei Überbevölkerung; Kinder zwischen 16 und 42 Jahren, umso häufiger, je mehr Platz ist. Bedürfnisse und Persönlichkeiten folgen später.</w:t>
+      </w:r>
+    </w:p>
+    <w:p>
+      <w:pPr>
+        <w:numPr>
+          <w:ilvl w:val="0"/>
+          <w:numId w:val="1005"/>
+        </w:numPr>
+        <w:pStyle w:val="Compact"/>
+      </w:pPr>
+      <w:r>
+        <w:rPr>
+          <w:bCs/>
+          <w:b/>
+        </w:rPr>
+        <w:t xml:space="preserve">Tragfähigkeit:</w:t>
+      </w:r>
+      <w:r>
+        <w:t xml:space="preserve"> Ein Hexfeld ernährt etwa 30 Menschen je Nahrungseinheit. Nahrung kommt aus Fruchtbarkeit, Wild und Fisch, an der Küste auch aus dem Fisch im angrenzenden Meer. Eine fruchtbare Ebene trägt so etwa 30 Menschen.</w:t>
+      </w:r>
+    </w:p>
+    <w:p>
+      <w:pPr>
+        <w:numPr>
+          <w:ilvl w:val="0"/>
+          <w:numId w:val="1005"/>
+        </w:numPr>
+        <w:pStyle w:val="Compact"/>
+      </w:pPr>
+      <w:r>
+        <w:rPr>
+          <w:bCs/>
+          <w:b/>
+        </w:rPr>
+        <w:t xml:space="preserve">Wachstum:</w:t>
+      </w:r>
+      <w:r>
+        <w:t xml:space="preserve"> Im Mittel über 6 Testwelten leben nach 100 Jahren etwa 1.400, nach 200 Jahren etwa 10.000 und nach 300 Jahren etwa 17.000 Menschen. Rechenzeit unter Node etwa 1,3 ms pro simuliertem Jahr; auf dem Handy (Hermes, grob 13-mal langsamer) also etwa 17 ms, bei der schnellsten Stufe (2 Jahre pro Sekunde) rund 35 ms Rechenzeit pro Sekunde.</w:t>
+      </w:r>
+    </w:p>
     <w:bookmarkEnd w:id="25"/>
     <w:bookmarkStart w:id="26" w:name="glaube-und-anbetung"/>
     <w:p>
@@ -1001,6 +1283,44 @@
       </w:pPr>
       <w:r>
         <w:t xml:space="preserve">Offen: Balance der Einflussmenge, da sie mit der Zahl der Gläubigen wächst.</w:t>
+      </w:r>
+    </w:p>
+    <w:p>
+      <w:pPr>
+        <w:numPr>
+          <w:ilvl w:val="0"/>
+          <w:numId w:val="1006"/>
+        </w:numPr>
+        <w:pStyle w:val="Compact"/>
+      </w:pPr>
+      <w:r>
+        <w:rPr>
+          <w:bCs/>
+          <w:b/>
+        </w:rPr>
+        <w:t xml:space="preserve">Glaube (Stand der Umsetzung):</w:t>
+      </w:r>
+      <w:r>
+        <w:t xml:space="preserve"> Kinder erben den Glauben der Eltern, und jeder Glaube gleicht sich dem Durchschnitt seines Hexfelds an. In der Spieler-Zivilisation wächst er mit dem Kulturwert „fromm“, in allen anderen verblasst er langsam. Ab einem Glaubenswert von 0,5 zählt ein Bewohner als Gläubiger. Der Startstamm beginnt mit 75–100 %. Gebete und Einflusspunkte sind noch nicht umgesetzt.</w:t>
+      </w:r>
+    </w:p>
+    <w:p>
+      <w:pPr>
+        <w:numPr>
+          <w:ilvl w:val="0"/>
+          <w:numId w:val="1006"/>
+        </w:numPr>
+        <w:pStyle w:val="Compact"/>
+      </w:pPr>
+      <w:r>
+        <w:rPr>
+          <w:bCs/>
+          <w:b/>
+        </w:rPr>
+        <w:t xml:space="preserve">Spielende (umgesetzt):</w:t>
+      </w:r>
+      <w:r>
+        <w:t xml:space="preserve"> Gibt es keinen Gläubigen mehr, hält die Zeit an und ein Hinweis bietet eine neue Welt an. In 60 Testwelten ist der Startstamm in den ersten 200 Jahren nie ausgestorben.</w:t>
       </w:r>
     </w:p>
     <w:bookmarkEnd w:id="26"/>
@@ -1877,11 +2197,61 @@
 </w:document>
 </file>
 
-<file path=word/comments.xml><?xml version="1.0" encoding="utf-8"?>
-<w:comments xmlns:w="http://schemas.openxmlformats.org/wordprocessingml/2006/main" xmlns:m="http://schemas.openxmlformats.org/officeDocument/2006/math" xmlns:r="http://schemas.openxmlformats.org/officeDocument/2006/relationships" xmlns:o="urn:schemas-microsoft-com:office:office" xmlns:v="urn:schemas-microsoft-com:vml" xmlns:w10="urn:schemas-microsoft-com:office:word" xmlns:a="http://schemas.openxmlformats.org/drawingml/2006/main" xmlns:pic="http://schemas.openxmlformats.org/drawingml/2006/picture" xmlns:wp="http://schemas.openxmlformats.org/drawingml/2006/wordprocessingDrawing"/>
+<file path=word\fontTable.xml><?xml version="1.0" encoding="utf-8"?>
+<w:fonts xmlns:r="http://schemas.openxmlformats.org/officeDocument/2006/relationships" xmlns:w="http://schemas.openxmlformats.org/wordprocessingml/2006/main">
+  <w:font w:name="Symbol">
+    <w:panose1 w:val="02000500000000000000"/>
+    <w:charset w:val="02"/>
+    <w:family w:val="auto"/>
+    <w:pitch w:val="variable"/>
+    <w:sig w:usb0="00000000" w:usb1="00000000" w:usb2="00010000" w:usb3="00000000" w:csb0="80000000" w:csb1="00000000"/>
+  </w:font>
+  <w:font w:name="Times New Roman">
+    <w:panose1 w:val="02020603050405020304"/>
+    <w:charset w:val="00"/>
+    <w:family w:val="auto"/>
+    <w:pitch w:val="variable"/>
+    <w:sig w:usb0="00000003" w:usb1="00000000" w:usb2="00000000" w:usb3="00000000" w:csb0="00000001" w:csb1="00000000"/>
+  </w:font>
+  <w:font w:name="Courier New">
+    <w:panose1 w:val="02070309020205020404"/>
+    <w:charset w:val="00"/>
+    <w:family w:val="auto"/>
+    <w:pitch w:val="variable"/>
+    <w:sig w:usb0="00000003" w:usb1="00000000" w:usb2="00000000" w:usb3="00000000" w:csb0="00000001" w:csb1="00000000"/>
+  </w:font>
+  <w:font w:name="Wingdings">
+    <w:panose1 w:val="05020102010804080708"/>
+    <w:charset w:val="02"/>
+    <w:family w:val="auto"/>
+    <w:pitch w:val="variable"/>
+    <w:sig w:usb0="00000000" w:usb1="00000000" w:usb2="00010000" w:usb3="00000000" w:csb0="80000000" w:csb1="00000000"/>
+  </w:font>
+  <w:font w:name="Cambria">
+    <w:panose1 w:val="02040503050406030204"/>
+    <w:charset w:val="00"/>
+    <w:family w:val="auto"/>
+    <w:pitch w:val="variable"/>
+    <w:sig w:usb0="00000003" w:usb1="00000000" w:usb2="00000000" w:usb3="00000000" w:csb0="00000001" w:csb1="00000000"/>
+  </w:font>
+  <w:font w:name="Calibri">
+    <w:panose1 w:val="020F0502020204030204"/>
+    <w:charset w:val="00"/>
+    <w:family w:val="auto"/>
+    <w:pitch w:val="variable"/>
+    <w:sig w:usb0="00000003" w:usb1="00000000" w:usb2="00000000" w:usb3="00000000" w:csb0="00000001" w:csb1="00000000"/>
+  </w:font>
+  <w:font w:name="Arial">
+    <w:panose1 w:val="020B0604020202020204"/>
+    <w:charset w:val="00"/>
+    <w:family w:val="auto"/>
+    <w:pitch w:val="variable"/>
+    <w:sig w:usb0="00000003" w:usb1="00000000" w:usb2="00000000" w:usb3="00000000" w:csb0="00000001" w:csb1="00000000"/>
+  </w:font>
+</w:fonts>
 </file>
 
-<file path=word/footnotes.xml><?xml version="1.0" encoding="utf-8"?>
+<file path=word\footnotes.xml><?xml version="1.0" encoding="utf-8"?>
 <w:footnotes xmlns:w="http://schemas.openxmlformats.org/wordprocessingml/2006/main" xmlns:m="http://schemas.openxmlformats.org/officeDocument/2006/math" xmlns:r="http://schemas.openxmlformats.org/officeDocument/2006/relationships" xmlns:o="urn:schemas-microsoft-com:office:office" xmlns:v="urn:schemas-microsoft-com:vml" xmlns:w10="urn:schemas-microsoft-com:office:word" xmlns:a="http://schemas.openxmlformats.org/drawingml/2006/main" xmlns:pic="http://schemas.openxmlformats.org/drawingml/2006/picture" xmlns:wp="http://schemas.openxmlformats.org/drawingml/2006/wordprocessingDrawing">
   <w:footnote w:type="continuationSeparator" w:id="0">
     <w:p>
@@ -1900,7 +2270,7 @@
 </w:footnotes>
 </file>
 
-<file path=word/numbering.xml><?xml version="1.0" encoding="utf-8"?>
+<file path=word\numbering.xml><?xml version="1.0" encoding="utf-8"?>
 <w:numbering xmlns:w="http://schemas.openxmlformats.org/wordprocessingml/2006/main">
   <w:abstractNum w:abstractNumId="990">
     <w:nsid w:val="A990"/>
@@ -2232,7 +2602,46 @@
 </w:numbering>
 </file>
 
-<file path=word/styles.xml><?xml version="1.0" encoding="utf-8"?>
+<file path=word\settings.xml><?xml version="1.0" encoding="utf-8"?>
+<w:settings xmlns:m="http://schemas.openxmlformats.org/officeDocument/2006/math" xmlns:o="urn:schemas-microsoft-com:office:office" xmlns:r="http://schemas.openxmlformats.org/officeDocument/2006/relationships" xmlns:sl="http://schemas.openxmlformats.org/schemaLibrary/2006/main" xmlns:v="urn:schemas-microsoft-com:vml" xmlns:w="http://schemas.openxmlformats.org/wordprocessingml/2006/main" xmlns:w10="urn:schemas-microsoft-com:office:word">
+  <w:stylePaneFormatFilter w:val="0004"/>
+  <w:footnotePr>
+    <w:footnote w:id="-1"/>
+    <w:footnote w:id="0"/>
+  </w:footnotePr>
+  <w:rsids>
+  </w:rsids>
+  <w:clrSchemeMapping w:accent1="accent1" w:accent2="accent2" w:accent3="accent3" w:accent4="accent4" w:accent5="accent5" w:accent6="accent6" w:bg1="light1" w:bg2="light2" w:followedHyperlink="followedHyperlink" w:hyperlink="hyperlink" w:t1="dark1" w:t2="dark2"/>
+  <w:zoom w:percent="100"/>
+  <w:embedSystemFonts/>
+  <w:proofState w:grammar="clean" w:spelling="clean"/>
+  <w:doNotTrackMoves/>
+  <w:defaultTabStop w:val="720"/>
+  <w:drawingGridHorizontalSpacing w:val="360"/>
+  <w:drawingGridVerticalSpacing w:val="360"/>
+  <w:displayHorizontalDrawingGridEvery w:val="0"/>
+  <w:displayVerticalDrawingGridEvery w:val="0"/>
+  <w:characterSpacingControl w:val="doNotCompress"/>
+  <w:savePreviewPicture/>
+  <m:mathPr>
+    <m:mathFont m:val="Cambria Math"/>
+    <m:brkBin m:val="before"/>
+    <m:brkBinSub m:val="--"/>
+    <m:smallFrac m:val="0"/>
+    <m:dispDef/>
+    <m:lMargin m:val="0"/>
+    <m:rMargin m:val="0"/>
+    <m:wrapRight/>
+    <m:intLim m:val="subSup"/>
+    <m:naryLim m:val="undOvr"/>
+  </m:mathPr>
+  <w:themeFontLang w:val="en-US"/>
+  <w:decimalSymbol w:val="."/>
+  <w:listSeparator w:val=","/>
+</w:settings>
+</file>
+
+<file path=word\styles.xml><?xml version="1.0" encoding="utf-8"?>
 <w:styles xmlns:r="http://schemas.openxmlformats.org/officeDocument/2006/relationships" xmlns:w="http://schemas.openxmlformats.org/wordprocessingml/2006/main">
   <w:docDefaults>
     <w:rPrDefault>
@@ -2955,7 +3364,7 @@
 </w:styles>
 </file>
 
-<file path=word/theme/theme1.xml><?xml version="1.0" encoding="utf-8"?>
+<file path=word\theme\theme1.xml><?xml version="1.0" encoding="utf-8"?>
 <a:theme xmlns:a="http://schemas.openxmlformats.org/drawingml/2006/main" name="Office Theme">
   <a:themeElements>
     <a:clrScheme name="Office">
@@ -3271,4 +3680,11 @@
   </a:objectDefaults>
   <a:extraClrSchemeLst/>
 </a:theme>
+</file>
+
+<file path=word\webSettings.xml><?xml version="1.0" encoding="utf-8"?>
+<ns0:webSettings xmlns:ns0="http://schemas.openxmlformats.org/wordprocessingml/2006/main">
+  <ns0:allowPNG/>
+  <ns0:doNotSaveAsSingleFile/>
+</ns0:webSettings>
 </file>
</xml_diff>

<commit_message>
Record the revised expansion, paused breakaways, faith ledger and FPS meter in the design doc
</commit_message>
<xml_diff>
--- a/Design Documents/Game Design Gott einer Zivilisation.docx
+++ b/Design Documents/Game Design Gott einer Zivilisation.docx
@@ -373,7 +373,7 @@
         <w:t xml:space="preserve">Zeitsteuerung:</w:t>
       </w:r>
       <w:r>
-        <w:t xml:space="preserve"> 1 Tick = 1 Woche. Pause und drei Geschwindigkeiten mit 6, 26 und 104 Wochen pro Sekunde (ein Jahr in etwa 9 s, 2 s bzw. 0,5 s). Das Spiel startet auf der langsamsten Stufe. Läuft die App nicht im Vordergrund, steht die Zeit.</w:t>
+        <w:t xml:space="preserve"> 1 Tick = 1 Woche. Pause und drei Geschwindigkeiten mit 6, 26 und 104 Wochen pro Sekunde (ein Jahr in etwa 9 s, 2 s bzw. 0,5 s). Das Spiel startet auf der langsamsten Stufe. Läuft die App nicht im Vordergrund, steht die Zeit. Das Tempo ist nach dem ersten Handytest bestätigt.</w:t>
       </w:r>
     </w:p>
     <w:p>
@@ -392,7 +392,26 @@
         <w:t xml:space="preserve">Völker-Panel:</w:t>
       </w:r>
       <w:r>
-        <w:t xml:space="preserve"> Schaltfläche „Peoples“ zeigt Jahr, Bewohner und Gläubige, alle Zivilisationen mit Farbe, Herkunft, Größe, Gebiet, Anteil der Gläubigen und Kultur sowie die Chronik.</w:t>
+        <w:t xml:space="preserve"> Schaltfläche „Peoples“ zeigt Jahr, Bewohner und Gläubige, einen Verlauf der letzten 100 Jahre (Gläubige im Verhältnis zur Bevölkerung), alle Zivilisationen mit Farbe, Herkunft, Größe, Gebiet, Kultur und Glaubensbilanz sowie die Chronik.</w:t>
+      </w:r>
+    </w:p>
+    <w:p>
+      <w:pPr>
+        <w:numPr>
+          <w:ilvl w:val="0"/>
+          <w:numId w:val="1002"/>
+        </w:numPr>
+        <w:pStyle w:val="Compact"/>
+      </w:pPr>
+      <w:r>
+        <w:rPr>
+          <w:bCs/>
+          <w:b/>
+        </w:rPr>
+        <w:t xml:space="preserve">Leistungsanzeige (Testphase):</w:t>
+      </w:r>
+      <w:r>
+        <w:t xml:space="preserve"> Oben links auf der Karte: Bilder pro Sekunde und langsamstes Bild auf dem UI-Thread (Gesten, Kartenzeichnung) und dem JavaScript-Thread (Simulation, Oberfläche), Rechenzeit der Simulation pro Sekunde, simulierte Wochen pro Sekunde und Dauer des letzten Neuzeichnens der Gebiete.</w:t>
       </w:r>
     </w:p>
     <w:bookmarkEnd w:id="22"/>
@@ -624,7 +643,7 @@
         <w:t xml:space="preserve">Gesellschaft je Hexfeld:</w:t>
       </w:r>
       <w:r>
-        <w:t xml:space="preserve"> Besitzende Zivilisation, Bevölkerung und durchschnittlicher Glaube. Wird vierteljährlich aus den Bewohnern berechnet und auf der Karte gezeigt: Farbfläche und Grenze je Zivilisation, ein Punkt je Siedlung, größer mit mehr Bewohnern. Das Hexfeld-Info zeigt Zivilisation, Bevölkerung und Glauben.</w:t>
+        <w:t xml:space="preserve"> Besitzende Zivilisation, Bevölkerung und durchschnittlicher Glaube. Wird vierteljährlich aus den Bewohnern berechnet und auf der Karte gezeigt: Farbfläche und Grenze je Zivilisation, ein Punkt je Siedlung, größer mit mehr Bewohnern. Wie das Gelände wird diese Ebene herausgezoomt als ein Bild und hineingezoomt als scharfe Kacheln nur in Bildschirmnähe gezeichnet. Die Hexfeld-Leiste zeigt Zivilisation, Bevölkerung und Glauben.</w:t>
       </w:r>
     </w:p>
     <w:p>
@@ -794,7 +813,7 @@
         <w:t xml:space="preserve">Entstehung neuer Zivilisationen:</w:t>
       </w:r>
       <w:r>
-        <w:t xml:space="preserve"> Auf zwei Wegen. Abspaltung: Siedlungen, die vom Zentrum der Zivilisation abgeschnitten oder mehr als 7 Hexfelder davon entfernt sind, können sich ab 25 Bewohnern lösen (etwa 8 % Chance pro Jahr, Mutter-Zivilisation ab 60 Bewohnern). Sie behalten 60 % ihres Glaubens an den Spieler, beten ihn als Zivilisation aber nicht mehr an. Neue Stämme: ab Jahr 25 erscheint gelegentlich (etwa 2 % pro Jahr) ein Stamm von 15–24 Menschen ohne Gott in leerem, fruchtbarem Land, mindestens 8 Hexfelder von allen anderen entfernt.</w:t>
+        <w:t xml:space="preserve"> Neue Stämme: ab Jahr 25 erscheint gelegentlich (etwa 2 % pro Jahr) ein Stamm von 15–24 Menschen ohne Gott in leerem, fruchtbarem Land, mindestens 8 Hexfelder von allen anderen entfernt.</w:t>
       </w:r>
     </w:p>
     <w:p>
@@ -810,10 +829,29 @@
           <w:bCs/>
           <w:b/>
         </w:rPr>
+        <w:t xml:space="preserve">Abspaltung (pausiert):</w:t>
+      </w:r>
+      <w:r>
+        <w:t xml:space="preserve"> Entschieden ist, dass auch abgeschnittene oder weit entfernte Siedlungen sich als eigene Zivilisation lösen können und dabei 60 % ihres Glaubens behalten. Nach dem ersten Test ist das vorerst abgeschaltet, weil es die Testpartien unübersichtlich macht und wenig Neues bringt. Die Regeln bleiben im Code und werden später wieder aufgegriffen.</w:t>
+      </w:r>
+    </w:p>
+    <w:p>
+      <w:pPr>
+        <w:numPr>
+          <w:ilvl w:val="0"/>
+          <w:numId w:val="1004"/>
+        </w:numPr>
+        <w:pStyle w:val="Compact"/>
+      </w:pPr>
+      <w:r>
+        <w:rPr>
+          <w:bCs/>
+          <w:b/>
+        </w:rPr>
         <w:t xml:space="preserve">Anzahl:</w:t>
       </w:r>
       <w:r>
-        <w:t xml:space="preserve"> Höchstens 6 Zivilisationen gleichzeitig. In Testläufen kommt die zweite nach etwa 50 Jahren dazu, nach etwa 125 Jahren sind es meist 6. Eine Zivilisation ohne Bewohner geht unter, ihr Platz wird frei.</w:t>
+        <w:t xml:space="preserve"> Höchstens 6 Zivilisationen gleichzeitig. In 60 Testwelten sind es nach 100 Jahren im Mittel 2,4, nach 200 Jahren 4,3. Eine Zivilisation ohne Bewohner geht unter, ihr Platz wird frei.</w:t>
       </w:r>
     </w:p>
     <w:p>
@@ -832,7 +870,7 @@
         <w:t xml:space="preserve">Kultur:</w:t>
       </w:r>
       <w:r>
-        <w:t xml:space="preserve"> Fünf Werte von 0 bis 1: seefahrend, kriegerisch, bäuerlich, wandernd, fromm. Sie entstehen aus dem Land rund um die erste Siedlung und gleichen sich jedes Jahr um 5 % an das bewohnte Land an: Küste macht seefahrend, Gefahr und raues Land kriegerisch, Fruchtbarkeit bäuerlich, offenes oder karges Land wandernd, Gefahr und Kargheit fromm. Abspaltungen starten zwischen der Kultur der Mutter-Zivilisation und der ihres Landes.</w:t>
+        <w:t xml:space="preserve"> Fünf Werte von 0 bis 1: seefahrend, kriegerisch, bäuerlich, wandernd, fromm. Sie entstehen aus dem Land rund um die erste Siedlung und gleichen sich jedes Jahr um 5 % an das bewohnte Land an: Küste macht seefahrend, Gefahr und raues Land kriegerisch, Fruchtbarkeit bäuerlich, offenes oder karges Land wandernd, Gefahr und Kargheit fromm.</w:t>
       </w:r>
     </w:p>
     <w:p>
@@ -851,7 +889,7 @@
         <w:t xml:space="preserve">Wirkung der Kultur (bisher):</w:t>
       </w:r>
       <w:r>
-        <w:t xml:space="preserve"> Sie bestimmt, welche Hexfelder als Siedlungsort gefallen, wie leicht Menschen weiterziehen, wie weit Siedlerzüge reichen, ob sie über Wasser setzen, und bei der Spieler-Zivilisation, wie schnell der Glaube wächst.</w:t>
+        <w:t xml:space="preserve"> Sie bestimmt, welche Hexfelder als Siedlungsort gefallen, wie schnell Menschen bei Enge weiterziehen, wie oft Siedler aufbrechen, ob sie über Wasser setzen, und bei der Spieler-Zivilisation, wie schnell der Glaube wächst.</w:t>
       </w:r>
     </w:p>
     <w:p>
@@ -870,7 +908,7 @@
         <w:t xml:space="preserve">Ausbreitung:</w:t>
       </w:r>
       <w:r>
-        <w:t xml:space="preserve"> Wird ein Hexfeld eng (ab 75 % der Tragfähigkeit), ziehen Bewohner ins attraktivste Nachbarfeld, seefahrende Völker auch über schmale Meeresstreifen. Zusätzlich zieht jährlich mit gewisser Wahrscheinlichkeit eine Siedlergruppe (6–11 Menschen) aus der engsten Siedlung einige Hexfelder weit in leeres Land. Fremdes Gebiet meiden sie, solange es keinen Krieg und keine Diplomatie gibt.</w:t>
+        <w:t xml:space="preserve"> Nach dem ersten Test bewusst geschlossen und vom Kern aus. Menschen ziehen nur bei Enge weiter (ab 60 % der Tragfähigkeit) und dann ins attraktivste Nachbarfeld. Seefahrende Völker (ab 0,5) können eine Meerenge von einem Hexfeld überqueren. Jedes Hexfeld verliert an Reiz, je weiter es von der Hauptsiedlung entfernt ist, damit Völker zusammenbleiben. Siedlergruppen (6–11 Menschen) brechen erst auf, wenn das Volk mindestens 60 Menschen hat und sein Land insgesamt zu 70 % voll ist. Sie gründen ein Dorf auf dem besten freien Land höchstens 2 Hexfelder von der eigenen Grenze. Fremdes Gebiet meiden alle, solange es keinen Krieg und keine Diplomatie gibt.</w:t>
       </w:r>
     </w:p>
     <w:p>
@@ -908,7 +946,7 @@
         <w:t xml:space="preserve">Namen und Chronik:</w:t>
       </w:r>
       <w:r>
-        <w:t xml:space="preserve"> Zivilisationen bekommen zufällig erzeugte Namen. Gründung, Abspaltung, neue Stämme, Untergang und das Spielende werden mit Jahr in der Chronik festgehalten.</w:t>
+        <w:t xml:space="preserve"> Zivilisationen bekommen zufällig erzeugte Namen. Gründung, neue Stämme, Untergang und das Spielende werden mit Jahr in der Chronik festgehalten.</w:t>
       </w:r>
     </w:p>
     <w:p>
@@ -927,7 +965,7 @@
         <w:t xml:space="preserve">Noch offen:</w:t>
       </w:r>
       <w:r>
-        <w:t xml:space="preserve"> Handel, Krieg, Bündnisse, eigene Religionen der Zivilisationen ohne Gott.</w:t>
+        <w:t xml:space="preserve"> Handel, Krieg, Bündnisse, eigene Religionen der Zivilisationen ohne Gott, Rückkehr der Abspaltungen.</w:t>
       </w:r>
     </w:p>
     <w:bookmarkEnd w:id="24"/>
@@ -1100,7 +1138,7 @@
         <w:t xml:space="preserve">Stand der Umsetzung:</w:t>
       </w:r>
       <w:r>
-        <w:t xml:space="preserve"> Einfache Bewohner mit Alter, Wohnort, Zivilisation und Glaube. Jeder Bewohner wird einmal pro Jahr aktualisiert, gestaffelt über die 52 Wochen-Ticks. Sterblichkeit nach Alter, Gefahr und Hunger bei Überbevölkerung; Kinder zwischen 16 und 42 Jahren, umso häufiger, je mehr Platz ist. Bedürfnisse und Persönlichkeiten folgen später.</w:t>
+        <w:t xml:space="preserve"> Einfache Bewohner mit Alter, Wohnort, Zivilisation und Glaube. Jeder Bewohner wird einmal pro Jahr aktualisiert, gestaffelt über die 52 Wochen-Ticks. Sterblichkeit nach Alter, Gefahr und Hunger bei Überbevölkerung. Kinder zwischen 16 und 42 Jahren: volle Geburtenrate bis zur halben Tragfähigkeit, darüber sinkend, keine mehr bei Überfüllung. Bedürfnisse und Persönlichkeiten folgen später.</w:t>
       </w:r>
     </w:p>
     <w:p>
@@ -1138,7 +1176,7 @@
         <w:t xml:space="preserve">Wachstum:</w:t>
       </w:r>
       <w:r>
-        <w:t xml:space="preserve"> Im Mittel über 6 Testwelten leben nach 100 Jahren etwa 1.400, nach 200 Jahren etwa 10.000 und nach 300 Jahren etwa 17.000 Menschen. Rechenzeit unter Node etwa 1,3 ms pro simuliertem Jahr; auf dem Handy (Hermes, grob 13-mal langsamer) also etwa 17 ms, bei der schnellsten Stufe (2 Jahre pro Sekunde) rund 35 ms Rechenzeit pro Sekunde.</w:t>
+        <w:t xml:space="preserve"> Im Mittel über 6 Testwelten leben nach 100 Jahren etwa 800, nach 200 Jahren etwa 3.800 und nach 300 Jahren etwa 11.800 Menschen. Rechenzeit unter Node etwa 1,1 ms pro simuliertem Jahr; auf dem Handy (Hermes, grob 13-mal langsamer) also etwa 14 ms, bei der schnellsten Stufe (2 Jahre pro Sekunde) rund 30 ms Rechenzeit pro Sekunde.</w:t>
       </w:r>
     </w:p>
     <w:bookmarkEnd w:id="25"/>
@@ -1301,7 +1339,26 @@
         <w:t xml:space="preserve">Glaube (Stand der Umsetzung):</w:t>
       </w:r>
       <w:r>
-        <w:t xml:space="preserve"> Kinder erben den Glauben der Eltern, und jeder Glaube gleicht sich dem Durchschnitt seines Hexfelds an. In der Spieler-Zivilisation wächst er mit dem Kulturwert „fromm“, in allen anderen verblasst er langsam. Ab einem Glaubenswert von 0,5 zählt ein Bewohner als Gläubiger. Der Startstamm beginnt mit 75–100 %. Gebete und Einflusspunkte sind noch nicht umgesetzt.</w:t>
+        <w:t xml:space="preserve"> Ab einem Glaubenswert von 0,5 zählt ein Bewohner als Gläubiger. Der Startstamm beginnt mit 75–100 %. Jedes Jahr wirken drei Kräfte: Umfeld (der Glaube gleicht sich um 10 % dem Durchschnitt des Hexfelds an), Frömmigkeit (in der Spieler-Zivilisation +2 % mal Kulturwert „fromm“) und Vergessen (in Zivilisationen ohne Gott −0,5 %). Kinder erben 90 % des Elternglaubens und 10 % des Umfelds, mit etwas Zufall. Gebete und Einflusspunkte sind noch nicht umgesetzt.</w:t>
+      </w:r>
+    </w:p>
+    <w:p>
+      <w:pPr>
+        <w:numPr>
+          <w:ilvl w:val="0"/>
+          <w:numId w:val="1006"/>
+        </w:numPr>
+        <w:pStyle w:val="Compact"/>
+      </w:pPr>
+      <w:r>
+        <w:rPr>
+          <w:bCs/>
+          <w:b/>
+        </w:rPr>
+        <w:t xml:space="preserve">Glaubensbilanz:</w:t>
+      </w:r>
+      <w:r>
+        <w:t xml:space="preserve"> Damit Glaubensverluste nachvollziehbar sind, führt jede Zivilisation pro Jahr Buch: als Gläubige geboren, gestorbene Gläubige, durch Frömmigkeit gläubig geworden, vom Umfeld gewonnen, durch zweifelnde Nachbarn verloren, vergessen. Ein Wechsel über die Grenze 0,5 wird der Kraft zugeschrieben, die am stärksten gewirkt hat. Die Bilanz geht genau auf (per Test geprüft) und steht im Völker-Panel zusammen mit einem Glaubensbalken (Durchschnitt und Grenze), der Zahl der Gläubigen und einer Erklärung der geltenden Regel.</w:t>
       </w:r>
     </w:p>
     <w:p>

</xml_diff>

<commit_message>
Add a mandatory map benchmark that every push must pass in CI
A new CI job builds an x86_64 APK with the benchmark switched on and runs it
on an Android emulator: 5 random worlds at zoom 2, 10 swipes in each of the
8 directions at 1500 pt/s. Every swipe must reach 60 fps with no frame over
25 ms, or the job fails; the summary lists failing swipes with seed and
direction. The Bench button runs the same benchmark on a phone.

AGENTS.md makes passing it a requirement for every agent and change, and the
design doc records the rule. The on-screen meter now learns the display's
refresh rate from all frames, so "missed" no longer reads too low when every
frame of a move was slow.

Co-Authored-By: Claude Opus 5.5 <noreply@anthropic.com>
Claude-Session: https://claude.ai/code/session_01Frj94Si1nffZqXBZCoaw7w
</commit_message>
<xml_diff>
--- a/Design Documents/Game Design Gott einer Zivilisation.docx
+++ b/Design Documents/Game Design Gott einer Zivilisation.docx
@@ -1810,6 +1810,22 @@
       </w:r>
       <w:r>
         <w:t xml:space="preserve">Englisch.</w:t>
+      </w:r>
+    </w:p>
+    <w:p>
+      <w:pPr>
+        <w:numPr>
+          <w:ilvl w:val="0"/>
+          <w:numId w:val="1010"/>
+        </w:numPr>
+        <w:pStyle w:val="Compact"/>
+      </w:pPr>
+      <w:r>
+        <w:rPr>
+          <w:bCs/>
+          <w:b/>
+        </w:rPr>
+        <w:t>Performance-Pflicht: Jeder Push durchläuft einen Karten-Benchmark auf einem Android-Emulator in CI. 5 zufällige Welten, Zoom ×2, 1500 pt/s, je 10 Wischer in alle 8 Richtungen (80 pro Welt). Jeder einzelne Wischer braucht mindestens 60 fps und keinen Frame über 25 ms. Eine Änderung gilt erst als fertig, wenn der Test besteht; neue Features erweitern ihn um eigene Szenarien.</w:t>
       </w:r>
     </w:p>
     <w:bookmarkEnd w:id="30"/>

</xml_diff>

<commit_message>
Draw zoomed-in map tiles as pre-rendered images instead of vector paths
Every frame used to redraw thousands of hex, river and icon paths for the
tiles on screen, which kept panning at 20-50 fps. Detail tiles (now 4x4
hexes) are rendered once on the JS thread into images, in three sharpness
tiers by zoom, nearest to the view first plus one ring ahead; moving the map
only moves finished images. Tiles overlap by a few pixels so no seams show,
a memory budget frees tiles that are no longer near the view, and while a
tile is still rendering a ready tier or the overview image stands in.
During a pinch the tier is held and tiles are scaled, so zooming no longer
hides icons.

Co-Authored-By: Claude Opus 5.5 <noreply@anthropic.com>
Claude-Session: https://claude.ai/code/session_01Frj94Si1nffZqXBZCoaw7w
</commit_message>
<xml_diff>
--- a/Design Documents/Game Design Gott einer Zivilisation.docx
+++ b/Design Documents/Game Design Gott einer Zivilisation.docx
@@ -1699,13 +1699,7 @@
           <w:bCs/>
           <w:b/>
         </w:rPr>
-        <w:t xml:space="preserve">Kartenrendering:</w:t>
-      </w:r>
-      <w:r>
-        <w:t xml:space="preserve"> </w:t>
-      </w:r>
-      <w:r>
-        <w:t xml:space="preserve">Skia (react-native-skia).</w:t>
+        <w:t>Kartenrendering: Skia (react-native-skia). Herausgezoomt ein vorgerendertes Übersichtsbild, hineingezoomt Detailkacheln (4×4 Hexfelder), die im Hintergrund einmal als Bilder gerendert werden, in drei Schärfestufen je nach Zoom. Beim Bewegen werden nur fertige Bilder verschoben, nie Vektorpfade neu gezeichnet.</w:t>
       </w:r>
     </w:p>
     <w:p>

</xml_diff>

<commit_message>
Show how each hex's food, water, space and resources are calculated
The expanded hex info now lists every term behind the three supplies (e.g.
fertility × 80, rain by moisture, river and river size, biome space) and,
per resource, the biome's base value, terrain variation, climate, river,
special location and the cap at 1. A slot for supply modifiers (abilities,
depletion) shows them as their own lines once they exist.

Generation and the simulation compute these values from the same terms the
info shows, so the explanation can't drift from the rules; a test checks
this for every hex. The terrain variation is now stored per hex to make the
resource calculation reproducible.

Co-Authored-By: Claude Opus 5.5 <noreply@anthropic.com>
Claude-Session: https://claude.ai/code/session_01Frj94Si1nffZqXBZCoaw7w
</commit_message>
<xml_diff>
--- a/Design Documents/Game Design Gott einer Zivilisation.docx
+++ b/Design Documents/Game Design Gott einer Zivilisation.docx
@@ -313,10 +313,7 @@
         <w:t xml:space="preserve">Hexfeld-Info:</w:t>
       </w:r>
       <w:r>
-        <w:t xml:space="preserve"> </w:t>
-      </w:r>
-      <w:r>
-        <w:t xml:space="preserve">Antippen eines Hexfelds zeigt ein Infofeld mit allen Werten.</w:t>
+        <w:t xml:space="preserve"> Antippen eines Hexfelds zeigt eine schmale Leiste mit den wichtigsten Angaben; aufgeklappt alle Werte mit Rechenweg: für Nahrung, Wasser und Platz jede Quelle als eigene Zeile (z. B. Fruchtbarkeit × 80, Regen nach Feuchtigkeit, Fluss, Biom), für jede Ressource Biom-Grundwert, Geländevariation, Klima, Fluss, Sondervorkommen und Kappung bei 1. Spätere Modifikatoren (Fähigkeiten, Erschöpfung) erscheinen als eigene Zeilen. Anzeige und Simulation rechnen mit denselben Termen, die Erklärung kann also nicht vom echten Wert abweichen.</w:t>
       </w:r>
     </w:p>
     <w:p>

</xml_diff>

<commit_message>
Make the civilization limit a soft cap and give every people a random color
New tribes still only appear while fewer than 6 peoples live, but land cut
off from its capital now always founds its own people. The per-hex storage
of people per civilization grows by doubling when a new id doesn't fit, up
to 255 peoples alive at once (ids stay one byte). In 13 test worlds over 800
years that gave 3.3 splits per world on average and at most 6 to 11 peoples.

Every people, including the player's, gets a random, clearly visible color
whose hue differs as much as possible from the living peoples' colors,
replacing the 8 fixed colors. Colors come from their own random generator,
so they don't change a world's history.

Co-Authored-By: Claude Opus 5.5 <noreply@anthropic.com>
Claude-Session: https://claude.ai/code/session_01Frj94Si1nffZqXBZCoaw7w
</commit_message>
<xml_diff>
--- a/Design Documents/Game Design Gott einer Zivilisation.docx
+++ b/Design Documents/Game Design Gott einer Zivilisation.docx
@@ -602,7 +602,7 @@
         <w:t xml:space="preserve">Gesellschaft je Hexfeld:</w:t>
       </w:r>
       <w:r>
-        <w:t xml:space="preserve"> Besitzende Zivilisation, Bevölkerung und durchschnittlicher Glaube. Wird vierteljährlich aus den Bewohnern berechnet und auf der Karte gezeigt: Farbfläche und Grenze je Zivilisation, ein Punkt je Siedlung, größer mit mehr Bewohnern, und die Straßen zwischen den Siedlungen. Wie das Gelände wird diese Ebene herausgezoomt als ein Bild und hineingezoomt als scharfe Kacheln nur in Bildschirmnähe gezeichnet. Die Hexfeld-Leiste zeigt Zivilisation, Bevölkerung und Glauben.</w:t>
+        <w:t xml:space="preserve"> Besitzende Zivilisation, Bevölkerung und durchschnittlicher Glaube. Wird vierteljährlich aus den Bewohnern berechnet und auf der Karte gezeigt: Farbfläche und Grenze je Zivilisation (jedes Volk, auch das des Spielers, bekommt bei der Gründung eine zufällige, gut sichtbare Farbe, deren Farbton sich möglichst stark von den lebenden Völkern unterscheidet; je Seed gleich), ein Punkt je Siedlung, größer mit mehr Bewohnern, und die Straßen zwischen den Siedlungen. Wie das Gelände wird diese Ebene herausgezoomt als ein Bild und hineingezoomt als scharfe Kacheln nur in Bildschirmnähe gezeichnet. Die Hexfeld-Leiste zeigt Zivilisation, Bevölkerung und Glauben.</w:t>
       </w:r>
     </w:p>
     <w:p>
@@ -697,26 +697,7 @@
         <w:t xml:space="preserve">Start:</w:t>
       </w:r>
       <w:r>
-        <w:t xml:space="preserve"> </w:t>
-      </w:r>
-      <w:r>
-        <w:t xml:space="preserve">Zu Spielbeginn existiert eine Zivilisation, der Stamm des Spielers. Weitere Zivilisationen entstehen im Laufe des Spiels, bis zu</w:t>
-      </w:r>
-      <w:r>
-        <w:t xml:space="preserve"> </w:t>
-      </w:r>
-      <w:r>
-        <w:rPr>
-          <w:bCs/>
-          <w:b/>
-        </w:rPr>
-        <w:t xml:space="preserve">3–6</w:t>
-      </w:r>
-      <w:r>
-        <w:t xml:space="preserve"> </w:t>
-      </w:r>
-      <w:r>
-        <w:t xml:space="preserve">gleichzeitig, jeweils mit eigener Persönlichkeit und Tiefe.</w:t>
+        <w:t xml:space="preserve"> Zu Spielbeginn existiert eine Zivilisation, der Stamm des Spielers. Weitere Zivilisationen entstehen im Laufe des Spiels, neue Stämme bis zu 6 gleichzeitig, durch Abspaltung auch mehr, jeweils mit eigener Persönlichkeit und Tiefe.</w:t>
       </w:r>
     </w:p>
     <w:p>
@@ -791,7 +772,7 @@
         <w:t>Abspaltung:</w:t>
       </w:r>
       <w:r>
-        <w:t xml:space="preserve"> Leert sich ein Hexfeld, verliert sein Volk die Kontrolle darüber; es wird freies Land, das jedes Volk besiedeln kann (alte Straßen bleiben). Hexfelder eines Volkes, die danach nicht mehr über Straßen durch eigenes Land mit der Hauptstadt verbunden sind, gründen ein eigenes Volk (je abgeschnittener Gruppe eins, größte zuerst, Hauptstadt ist das bevölkerungsreichste Feld der Gruppe). Die Menschen behalten 60 % ihres Glaubens und beten den Spieler nicht mehr an. Geprüft wird vierteljährlich. Sind schon 6 Völker da, bleibt die Gruppe bei ihrem Volk, bis ein Platz frei wird. Das ist selten: in 13 Testwelten über 600 Jahre dreimal, erstmals nach 250 bis 400 Jahren. Die frühere Abspaltung weit entfernter Siedlungen (ab 7 Hexfeldern von der Hauptstadt) bleibt pausiert.</w:t>
+        <w:t xml:space="preserve"> Leert sich ein Hexfeld, verliert sein Volk die Kontrolle darüber; es wird freies Land, das jedes Volk besiedeln kann (alte Straßen bleiben). Hexfelder eines Volkes, die danach nicht mehr über Straßen durch eigenes Land mit der Hauptstadt verbunden sind, gründen ein eigenes Volk (je abgeschnittener Gruppe eins, größte zuerst, Hauptstadt ist das bevölkerungsreichste Feld der Gruppe). Die Menschen behalten 60 % ihres Glaubens und beten den Spieler nicht mehr an. Geprüft wird vierteljährlich; die weiche Grenze von 6 Völkern gilt hier nicht. In 13 Testwelten über 800 Jahre gab es im Mittel 3,3 Abspaltungen je Welt (0 bis 6), die erste nach 250 bis 680 Jahren. Die frühere Abspaltung weit entfernter Siedlungen (ab 7 Hexfeldern von der Hauptstadt) bleibt pausiert.</w:t>
       </w:r>
     </w:p>
     <w:p>
@@ -810,7 +791,7 @@
         <w:t xml:space="preserve">Anzahl:</w:t>
       </w:r>
       <w:r>
-        <w:t xml:space="preserve"> Höchstens 6 Zivilisationen gleichzeitig. In 12 Testwelten sind es nach 100 Jahren im Mittel 2,7, nach 200 Jahren 4,6. Eine Zivilisation ohne Bewohner geht unter, ihr Platz wird frei.</w:t>
+        <w:t xml:space="preserve"> 6 ist eine weiche Grenze: Neue Stämme entstehen nur, solange weniger als 6 Völker leben. Abspaltungen dürfen darüber hinausgehen; technisch sind bis zu 255 Völker gleichzeitig möglich (der Speicher je Hexfeld wächst bei Bedarf mit). In 12 Testwelten sind es nach 100 Jahren im Mittel 2,7, nach 200 Jahren 4,6; in 13 Testwelten über 800 Jahre höchstens 6 bis 11 gleichzeitig. Eine Zivilisation ohne Bewohner geht unter, ihr Platz wird frei.</w:t>
       </w:r>
     </w:p>
     <w:p>

</xml_diff>

<commit_message>
Show trade in the hex info, mark harbors and add the trade benchmark
The hex info shows money, grain and water barrels, merchants at home and
on the way, the last partner and what a settlement asks for and spares;
harbors carry an anchor on the map. New benchmark scenario "trade": 300
years, then a trade center in every settlement, a harbor on every coast
and luxury goods to sell, so merchants are busy during the swipes. Design
doc, requirement and AGENTS.md list it.

Co-Authored-By: Claude Opus 5.5 <noreply@anthropic.com>
Claude-Session: https://claude.ai/code/session_01Frj94RHJxMQSEWvToceAyP
</commit_message>
<xml_diff>
--- a/Design Documents/Game Design Gott einer Zivilisation.docx
+++ b/Design Documents/Game Design Gott einer Zivilisation.docx
@@ -978,6 +978,101 @@
           <w:bCs/>
           <w:b/>
         </w:rPr>
+        <w:t>Interner Handel (Requirement „Handel“):</w:t>
+      </w:r>
+      <w:r>
+        <w:t xml:space="preserve"> Siedlungen eines Volks tauschen, was sie übrig haben, gegen das, was ihnen fehlt; Handel mit anderen Völkern kommt mit der Außenpolitik. Waren: Holz (Gewicht 1, Preis 1), Stein (1,5 / 1,5), Geld (0,1), Getreide und Wasserfässer (1 / 1), Luxusgüter (0,5 / 5). Jeder Erwachsene (ab 16) erzeugt 0,1 Geld pro Jahr; Geld kauft Waren, Unterhalt, Steuern und Tribut in Geld kommen später.</w:t>
+      </w:r>
+    </w:p>
+    <w:p>
+      <w:pPr>
+        <w:numPr>
+          <w:ilvl w:val="0"/>
+          <w:numId w:val="1004"/>
+        </w:numPr>
+        <w:pStyle w:val="Compact"/>
+      </w:pPr>
+      <w:r>
+        <w:rPr>
+          <w:bCs/>
+          <w:b/>
+        </w:rPr>
+        <w:t>Händler:</w:t>
+      </w:r>
+      <w:r>
+        <w:t xml:space="preserve"> Ein Handelszentrum (25 Holz + 15 Stein, Unterhalt 1 + 1, 2 Jahre) und ein Hafen (nur an Meer oder See, 30 Holz + 10 Stein, Unterhalt 1 + 1, 2 Jahre) geben je 2 Händler mit 20 Gewichtseinheiten Ladung; ein Handelsgebäude auf einer Seite reicht, jeder Hafen des Volks steht allen seinen Händlern offen. Händler sind Fahrten, keine Bewohner, und werden auf der Karte nicht gezeigt. Ein Händler wählt die Fahrt mit dem meisten Wert pro Woche: hin, was daheim übrig ist und dort verlangt wird, zurück, was daheim verlangt wird und dort übrig ist (mit Geld von daheim); bezahlt wird bei Ankunft, fehlt dem Käufer Geld, mit Ware. Verlangt wird, was dem nächsten Gebäude an Holz und Stein fehlt, Getreide und Wasser, wenn sie die knappste Versorgung sind, und 2 Jahre Bedarf an Luxusgütern.</w:t>
+      </w:r>
+    </w:p>
+    <w:p>
+      <w:pPr>
+        <w:numPr>
+          <w:ilvl w:val="0"/>
+          <w:numId w:val="1004"/>
+        </w:numPr>
+        <w:pStyle w:val="Compact"/>
+      </w:pPr>
+      <w:r>
+        <w:rPr>
+          <w:bCs/>
+          <w:b/>
+        </w:rPr>
+        <w:t>Wege:</w:t>
+      </w:r>
+      <w:r>
+        <w:t xml:space="preserve"> Händler reisen nur über Straßen (× 0,5 Geländekosten), Flüsse (flussabwärts × 0,25, flussaufwärts × 0,75, von beiden Ufern aus erreichbar) und über Wasser zwischen zwei Häfen (1 pro Feld, höchstens 12 Felder; auch Meerengen brauchen Häfen), nie durch Land eines anderen Volks; höchstens 26 Wochen weit. Eine Siedlung mit Händlern baut Stück für Stück eine Straße über eigenes oder freies Land, wenn der Weg zum letzten Handelspartner dadurch mindestens 25 % kürzer wird (3 Holz + 3 Stein × Geländekosten je Stück). Pro Feld besteht eine Chance, ein Viertel der Ladung zu verlieren: 2 % an Land, 6 % auf Wasser, plus 4 % × Gefahr. Flüsse fließen garantiert bergab; die Generierung gräbt das Flussbett ein, wo sie eine Senke aufgefüllt hatte.</w:t>
+      </w:r>
+    </w:p>
+    <w:p>
+      <w:pPr>
+        <w:numPr>
+          <w:ilvl w:val="0"/>
+          <w:numId w:val="1004"/>
+        </w:numPr>
+        <w:pStyle w:val="Compact"/>
+      </w:pPr>
+      <w:r>
+        <w:rPr>
+          <w:bCs/>
+          <w:b/>
+        </w:rPr>
+        <w:t>Getreide und Wasser:</w:t>
+      </w:r>
+      <w:r>
+        <w:t xml:space="preserve"> Ein Kornspeicher macht aus 25 Nahrung 25 Getreide pro Jahr, Wasserträger aus 25 Wasser 25 Fässer; gebaut nur, wenn das Feld 25 mehr hat, als es nutzt, und das Volk mehr verlangt, als es übrig hat und herstellt. Getreide und Fässer im Vorrat zählen als Nahrung bzw. Wasser (bis 50 Menschen); am Jahresende wird davon verbraucht, was fehlt. Abbaugebäude für Luxusgüter werden auf ihrem Vorkommen immer gebaut, weil das ganze Reich sie braucht. Handelszentrum und Hafen kommen nach Wachstum und Zufriedenheit: ein Handelszentrum, wenn eine Fahrt mit 15 Geld Wert erreichbar ist, ein Hafen, wenn der Weg übers Wasser kürzer wäre.</w:t>
+      </w:r>
+    </w:p>
+    <w:p>
+      <w:pPr>
+        <w:numPr>
+          <w:ilvl w:val="0"/>
+          <w:numId w:val="1004"/>
+        </w:numPr>
+        <w:pStyle w:val="Compact"/>
+      </w:pPr>
+      <w:r>
+        <w:rPr>
+          <w:bCs/>
+          <w:b/>
+        </w:rPr>
+        <w:t>Handel in Zahlen:</w:t>
+      </w:r>
+      <w:r>
+        <w:t xml:space="preserve"> In 12 Testwelten über 300 Jahre leben mit Handel etwa 61.800 statt 57.900 Menschen (+7 %); geliefert werden vor allem Getreide und Wasser, dazu Holz, Stein und Luxusgüter, etwa 1,5 % geht unterwegs verloren. Geld sammelt sich an, weil es nur für fehlende Waren ausgegeben wird. Damit kein Wochenschritt zu lang wird, sucht die Simulation höchstens 3 Handelswege pro Woche; Siedlungen ohne passendes Angebot oder passende Nachfrage suchen gar nicht. Die Hexfeld-Info zeigt Geld, Getreide, Fässer, Händler daheim und unterwegs, den letzten Partner und was die Siedlung verlangt und übrig hat; Häfen tragen auf der Karte einen Anker.</w:t>
+      </w:r>
+    </w:p>
+    <w:p>
+      <w:pPr>
+        <w:numPr>
+          <w:ilvl w:val="0"/>
+          <w:numId w:val="1004"/>
+        </w:numPr>
+        <w:pStyle w:val="Compact"/>
+      </w:pPr>
+      <w:r>
+        <w:rPr>
+          <w:bCs/>
+          <w:b/>
+        </w:rPr>
         <w:t xml:space="preserve">Zufriedenheit: </w:t>
       </w:r>
       <w:r>
@@ -1130,10 +1225,10 @@
           <w:bCs/>
           <w:b/>
         </w:rPr>
-        <w:t xml:space="preserve">Noch offen: </w:t>
-      </w:r>
-      <w:r>
-        <w:t>Handel (auch Transport von Holz, Stein und Luxusgütern), Erschöpfung der Rohstoffe, Erz, Einfluss von Kultur und Traits auf das Bauen und die Zufriedenheit, Glaube als Bedürfnis, Sicherheit (Krieg) als Teil der Zufriedenheit, Einfluss des Spielers auf die Zufriedenheit (Wunder, Segen), Außenpolitik (Zuwanderung, Beziehung nach einer Revolution), Kartenmodus für die Zufriedenheit, Krieg, Bündnisse, eigene Religionen der Zivilisationen ohne Gott.</w:t>
+        <w:t>Noch offen:</w:t>
+      </w:r>
+      <w:r>
+        <w:t xml:space="preserve"> Handel mit anderen Völkern und Preise nach Knappheit, Geld für Unterhalt, Steuern und Tribut, Erschöpfung der Rohstoffe, Erz, Einfluss von Kultur und Traits auf das Bauen und die Zufriedenheit, Glaube als Bedürfnis, Sicherheit (Krieg) als Teil der Zufriedenheit, Einfluss des Spielers auf die Zufriedenheit (Wunder, Segen), Außenpolitik (Zuwanderung, Beziehung nach einer Revolution), Kartenmodus für die Zufriedenheit, Krieg, Bündnisse, eigene Religionen der Zivilisationen ohne Gott.</w:t>
       </w:r>
     </w:p>
     <w:bookmarkEnd w:id="24"/>

</xml_diff>